<commit_message>
Documentacion completa con enlaces y evidencias finales
</commit_message>
<xml_diff>
--- a/Memoria_Tecnica_DAM2_Productos.docx
+++ b/Memoria_Tecnica_DAM2_Productos.docx
@@ -245,6 +245,112 @@
           <w:sz w:val="20"/>
         </w:rPr>
         <w:t>1. Objetivos del Proyecto y Requisitos Técnicos</w:t>
+      </w:r>
+    </w:p>
+    <w:p>
+      <w:pPr>
+        <w:spacing w:before="40" w:after="40"/>
+      </w:pPr>
+      <w:r>
+        <w:rPr>
+          <w:rFonts w:ascii="Calibri" w:hAnsi="Calibri"/>
+          <w:b/>
+          <w:color w:val="2B6CB0"/>
+          <w:sz w:val="20"/>
+        </w:rPr>
+        <w:t xml:space="preserve">• Despliegue en Producción (Vercel - About): </w:t>
+      </w:r>
+      <w:r>
+        <w:rPr>
+          <w:rFonts w:ascii="Consolas" w:hAnsi="Consolas"/>
+          <w:color w:val="2B6CB0"/>
+          <w:sz w:val="19"/>
+          <w:u w:val="single"/>
+        </w:rPr>
+        <w:t>https://dam2-productos-theta.vercel.app/about</w:t>
+      </w:r>
+    </w:p>
+    <w:p>
+      <w:pPr>
+        <w:spacing w:before="40" w:after="40"/>
+      </w:pPr>
+      <w:r>
+        <w:rPr>
+          <w:rFonts w:ascii="Calibri" w:hAnsi="Calibri"/>
+          <w:b/>
+          <w:color w:val="2B6CB0"/>
+          <w:sz w:val="20"/>
+        </w:rPr>
+        <w:t xml:space="preserve">• Despliegue en Producción (Vercel - Productos): </w:t>
+      </w:r>
+      <w:r>
+        <w:rPr>
+          <w:rFonts w:ascii="Consolas" w:hAnsi="Consolas"/>
+          <w:color w:val="2B6CB0"/>
+          <w:sz w:val="19"/>
+          <w:u w:val="single"/>
+        </w:rPr>
+        <w:t>https://dam2-productos-theta.vercel.app/productos</w:t>
+      </w:r>
+    </w:p>
+    <w:p>
+      <w:pPr>
+        <w:spacing w:before="40" w:after="40"/>
+      </w:pPr>
+      <w:r>
+        <w:rPr>
+          <w:rFonts w:ascii="Calibri" w:hAnsi="Calibri"/>
+          <w:b/>
+          <w:color w:val="2B6CB0"/>
+          <w:sz w:val="20"/>
+        </w:rPr>
+        <w:t xml:space="preserve">• Despliegue en Producción (Vercel - Inicio): </w:t>
+      </w:r>
+      <w:r>
+        <w:rPr>
+          <w:rFonts w:ascii="Consolas" w:hAnsi="Consolas"/>
+          <w:color w:val="2B6CB0"/>
+          <w:sz w:val="19"/>
+          <w:u w:val="single"/>
+        </w:rPr>
+        <w:t>https://dam2-productos-theta.vercel.app/inicio</w:t>
+      </w:r>
+    </w:p>
+    <w:p>
+      <w:pPr>
+        <w:spacing w:before="40" w:after="40"/>
+      </w:pPr>
+      <w:r>
+        <w:rPr>
+          <w:rFonts w:ascii="Calibri" w:hAnsi="Calibri"/>
+          <w:b/>
+          <w:color w:val="2B6CB0"/>
+          <w:sz w:val="20"/>
+        </w:rPr>
+        <w:t xml:space="preserve">• Repositorio GitHub (Rama 'desarrollo'): </w:t>
+      </w:r>
+      <w:r>
+        <w:rPr>
+          <w:rFonts w:ascii="Consolas" w:hAnsi="Consolas"/>
+          <w:color w:val="2B6CB0"/>
+          <w:sz w:val="19"/>
+          <w:u w:val="single"/>
+        </w:rPr>
+        <w:t>https://github.com/alex060/dam2-productos.git</w:t>
+      </w:r>
+    </w:p>
+    <w:p>
+      <w:pPr>
+        <w:spacing w:before="160" w:after="40"/>
+      </w:pPr>
+      <w:r>
+        <w:rPr>
+          <w:rFonts w:ascii="Calibri" w:hAnsi="Calibri"/>
+          <w:b/>
+          <w:color w:val="1A365D"/>
+          <w:sz w:val="22"/>
+        </w:rPr>
+        <w:t>🔗 ENLACES OFICIALES DE ENTREGA DEL PROYECTO:</w:t>
       </w:r>
     </w:p>
     <w:p>
@@ -2986,16 +3092,236 @@
               </w:rPr>
               <w:t>Captura de la consola ejecutando 'git branch --show-current' y captura del repositorio en GitHub donde se comprueba que la rama activa es 'desarrollo'.</w:t>
               <w:br/>
-              <w:br/>
             </w:r>
             <w:r>
               <w:rPr>
-                <w:rFonts w:ascii="Consolas" w:hAnsi="Consolas"/>
+                <w:rFonts w:ascii="Calibri" w:hAnsi="Calibri"/>
                 <w:b/>
-                <w:color w:val="38A169"/>
-                <w:sz w:val="19"/>
+                <w:color w:val="22543D"/>
+                <w:sz w:val="21"/>
               </w:rPr>
               <w:t>[ ESPACIO RESERVADO PARA CAPTURA DE PANTALLA - EVIDENCIA 9 ]</w:t>
+              <w:br/>
+            </w:r>
+          </w:p>
+          <w:p>
+            <w:pPr>
+              <w:spacing w:before="120" w:after="40"/>
+              <w:jc w:val="center"/>
+            </w:pPr>
+            <w:r>
+              <w:drawing>
+                <wp:inline xmlns:a="http://schemas.openxmlformats.org/drawingml/2006/main" xmlns:pic="http://schemas.openxmlformats.org/drawingml/2006/picture">
+                  <wp:extent cx="5303520" cy="4777740"/>
+                  <wp:docPr id="9" name="Picture 9"/>
+                  <wp:cNvGraphicFramePr>
+                    <a:graphicFrameLocks noChangeAspect="1"/>
+                  </wp:cNvGraphicFramePr>
+                  <a:graphic>
+                    <a:graphicData uri="http://schemas.openxmlformats.org/drawingml/2006/picture">
+                      <pic:pic>
+                        <pic:nvPicPr>
+                          <pic:cNvPr id="0" name="media_1791198025283.png"/>
+                          <pic:cNvPicPr/>
+                        </pic:nvPicPr>
+                        <pic:blipFill>
+                          <a:blip r:embed="rId17"/>
+                          <a:stretch>
+                            <a:fillRect/>
+                          </a:stretch>
+                        </pic:blipFill>
+                        <pic:spPr>
+                          <a:xfrm>
+                            <a:off x="0" y="0"/>
+                            <a:ext cx="5303520" cy="4777740"/>
+                          </a:xfrm>
+                          <a:prstGeom prst="rect"/>
+                        </pic:spPr>
+                      </pic:pic>
+                    </a:graphicData>
+                  </a:graphic>
+                </wp:inline>
+              </w:drawing>
+            </w:r>
+          </w:p>
+          <w:p>
+            <w:pPr>
+              <w:spacing w:before="20" w:after="80"/>
+              <w:jc w:val="center"/>
+            </w:pPr>
+            <w:r>
+              <w:rPr>
+                <w:rFonts w:ascii="Calibri" w:hAnsi="Calibri"/>
+                <w:i/>
+                <w:color w:val="718096"/>
+                <w:sz w:val="17"/>
+              </w:rPr>
+              <w:t>Ilustración 9.1: Commit inicial con los 46 archivos del proyecto Standalone</w:t>
+            </w:r>
+          </w:p>
+          <w:p>
+            <w:pPr>
+              <w:spacing w:before="120" w:after="40"/>
+              <w:jc w:val="center"/>
+            </w:pPr>
+            <w:r>
+              <w:drawing>
+                <wp:inline xmlns:a="http://schemas.openxmlformats.org/drawingml/2006/main" xmlns:pic="http://schemas.openxmlformats.org/drawingml/2006/picture">
+                  <wp:extent cx="5303520" cy="2698282"/>
+                  <wp:docPr id="10" name="Picture 10"/>
+                  <wp:cNvGraphicFramePr>
+                    <a:graphicFrameLocks noChangeAspect="1"/>
+                  </wp:cNvGraphicFramePr>
+                  <a:graphic>
+                    <a:graphicData uri="http://schemas.openxmlformats.org/drawingml/2006/picture">
+                      <pic:pic>
+                        <pic:nvPicPr>
+                          <pic:cNvPr id="0" name="media_1791198035364.png"/>
+                          <pic:cNvPicPr/>
+                        </pic:nvPicPr>
+                        <pic:blipFill>
+                          <a:blip r:embed="rId18"/>
+                          <a:stretch>
+                            <a:fillRect/>
+                          </a:stretch>
+                        </pic:blipFill>
+                        <pic:spPr>
+                          <a:xfrm>
+                            <a:off x="0" y="0"/>
+                            <a:ext cx="5303520" cy="2698282"/>
+                          </a:xfrm>
+                          <a:prstGeom prst="rect"/>
+                        </pic:spPr>
+                      </pic:pic>
+                    </a:graphicData>
+                  </a:graphic>
+                </wp:inline>
+              </w:drawing>
+            </w:r>
+          </w:p>
+          <w:p>
+            <w:pPr>
+              <w:spacing w:before="20" w:after="80"/>
+              <w:jc w:val="center"/>
+            </w:pPr>
+            <w:r>
+              <w:rPr>
+                <w:rFonts w:ascii="Calibri" w:hAnsi="Calibri"/>
+                <w:i/>
+                <w:color w:val="718096"/>
+                <w:sz w:val="17"/>
+              </w:rPr>
+              <w:t>Ilustración 9.2: Creación y cambio a la rama de trabajo 'desarrollo'</w:t>
+            </w:r>
+          </w:p>
+          <w:p>
+            <w:pPr>
+              <w:spacing w:before="120" w:after="40"/>
+              <w:jc w:val="center"/>
+            </w:pPr>
+            <w:r>
+              <w:drawing>
+                <wp:inline xmlns:a="http://schemas.openxmlformats.org/drawingml/2006/main" xmlns:pic="http://schemas.openxmlformats.org/drawingml/2006/picture">
+                  <wp:extent cx="5303520" cy="2698282"/>
+                  <wp:docPr id="11" name="Picture 11"/>
+                  <wp:cNvGraphicFramePr>
+                    <a:graphicFrameLocks noChangeAspect="1"/>
+                  </wp:cNvGraphicFramePr>
+                  <a:graphic>
+                    <a:graphicData uri="http://schemas.openxmlformats.org/drawingml/2006/picture">
+                      <pic:pic>
+                        <pic:nvPicPr>
+                          <pic:cNvPr id="0" name="image.png"/>
+                          <pic:cNvPicPr/>
+                        </pic:nvPicPr>
+                        <pic:blipFill>
+                          <a:blip r:embed="rId18"/>
+                          <a:stretch>
+                            <a:fillRect/>
+                          </a:stretch>
+                        </pic:blipFill>
+                        <pic:spPr>
+                          <a:xfrm>
+                            <a:off x="0" y="0"/>
+                            <a:ext cx="5303520" cy="2698282"/>
+                          </a:xfrm>
+                          <a:prstGeom prst="rect"/>
+                        </pic:spPr>
+                      </pic:pic>
+                    </a:graphicData>
+                  </a:graphic>
+                </wp:inline>
+              </w:drawing>
+            </w:r>
+          </w:p>
+          <w:p>
+            <w:pPr>
+              <w:spacing w:before="20" w:after="80"/>
+              <w:jc w:val="center"/>
+            </w:pPr>
+            <w:r>
+              <w:rPr>
+                <w:rFonts w:ascii="Calibri" w:hAnsi="Calibri"/>
+                <w:i/>
+                <w:color w:val="718096"/>
+                <w:sz w:val="17"/>
+              </w:rPr>
+              <w:t>Ilustración 9.1: Verificación en terminal de la rama activa 'desarrollo'</w:t>
+            </w:r>
+          </w:p>
+          <w:p>
+            <w:pPr>
+              <w:spacing w:before="120" w:after="40"/>
+              <w:jc w:val="center"/>
+            </w:pPr>
+            <w:r>
+              <w:drawing>
+                <wp:inline xmlns:a="http://schemas.openxmlformats.org/drawingml/2006/main" xmlns:pic="http://schemas.openxmlformats.org/drawingml/2006/picture">
+                  <wp:extent cx="5303520" cy="4897146"/>
+                  <wp:docPr id="12" name="Picture 12"/>
+                  <wp:cNvGraphicFramePr>
+                    <a:graphicFrameLocks noChangeAspect="1"/>
+                  </wp:cNvGraphicFramePr>
+                  <a:graphic>
+                    <a:graphicData uri="http://schemas.openxmlformats.org/drawingml/2006/picture">
+                      <pic:pic>
+                        <pic:nvPicPr>
+                          <pic:cNvPr id="0" name="media_1791198161854.png"/>
+                          <pic:cNvPicPr/>
+                        </pic:nvPicPr>
+                        <pic:blipFill>
+                          <a:blip r:embed="rId19"/>
+                          <a:stretch>
+                            <a:fillRect/>
+                          </a:stretch>
+                        </pic:blipFill>
+                        <pic:spPr>
+                          <a:xfrm>
+                            <a:off x="0" y="0"/>
+                            <a:ext cx="5303520" cy="4897146"/>
+                          </a:xfrm>
+                          <a:prstGeom prst="rect"/>
+                        </pic:spPr>
+                      </pic:pic>
+                    </a:graphicData>
+                  </a:graphic>
+                </wp:inline>
+              </w:drawing>
+            </w:r>
+          </w:p>
+          <w:p>
+            <w:pPr>
+              <w:spacing w:before="20" w:after="80"/>
+              <w:jc w:val="center"/>
+            </w:pPr>
+            <w:r>
+              <w:rPr>
+                <w:rFonts w:ascii="Calibri" w:hAnsi="Calibri"/>
+                <w:i/>
+                <w:color w:val="718096"/>
+                <w:sz w:val="17"/>
+              </w:rPr>
+              <w:t>Ilustración 9.2: Repositorio dam2-productos en GitHub publicado en la rama 'desarrollo'</w:t>
             </w:r>
           </w:p>
         </w:tc>
@@ -3152,16 +3478,174 @@
               </w:rPr>
               <w:t>Captura del panel de control de Vercel mostrando el despliegue con la rama 'desarrollo' y captura de la web pública en /productos cargando sin errores 404 al recargar.</w:t>
               <w:br/>
+            </w:r>
+            <w:r>
+              <w:rPr>
+                <w:rFonts w:ascii="Calibri" w:hAnsi="Calibri"/>
+                <w:b/>
+                <w:color w:val="22543D"/>
+                <w:sz w:val="21"/>
+              </w:rPr>
+              <w:t>[ ESPACIO RESERVADO PARA CAPTURA DE PANTALLA - EVIDENCIA 10 ]</w:t>
               <w:br/>
+            </w:r>
+          </w:p>
+          <w:p>
+            <w:pPr>
+              <w:spacing w:before="120" w:after="40"/>
+              <w:jc w:val="center"/>
+            </w:pPr>
+            <w:r>
+              <w:drawing>
+                <wp:inline xmlns:a="http://schemas.openxmlformats.org/drawingml/2006/main" xmlns:pic="http://schemas.openxmlformats.org/drawingml/2006/picture">
+                  <wp:extent cx="5303520" cy="4524681"/>
+                  <wp:docPr id="13" name="Picture 13"/>
+                  <wp:cNvGraphicFramePr>
+                    <a:graphicFrameLocks noChangeAspect="1"/>
+                  </wp:cNvGraphicFramePr>
+                  <a:graphic>
+                    <a:graphicData uri="http://schemas.openxmlformats.org/drawingml/2006/picture">
+                      <pic:pic>
+                        <pic:nvPicPr>
+                          <pic:cNvPr id="0" name="media_1791198282409.png"/>
+                          <pic:cNvPicPr/>
+                        </pic:nvPicPr>
+                        <pic:blipFill>
+                          <a:blip r:embed="rId20"/>
+                          <a:stretch>
+                            <a:fillRect/>
+                          </a:stretch>
+                        </pic:blipFill>
+                        <pic:spPr>
+                          <a:xfrm>
+                            <a:off x="0" y="0"/>
+                            <a:ext cx="5303520" cy="4524681"/>
+                          </a:xfrm>
+                          <a:prstGeom prst="rect"/>
+                        </pic:spPr>
+                      </pic:pic>
+                    </a:graphicData>
+                  </a:graphic>
+                </wp:inline>
+              </w:drawing>
+            </w:r>
+          </w:p>
+          <w:p>
+            <w:pPr>
+              <w:spacing w:before="20" w:after="80"/>
+              <w:jc w:val="center"/>
+            </w:pPr>
+            <w:r>
+              <w:rPr>
+                <w:rFonts w:ascii="Calibri" w:hAnsi="Calibri"/>
+                <w:i/>
+                <w:color w:val="718096"/>
+                <w:sz w:val="17"/>
+              </w:rPr>
+              <w:t>Ilustración 10.1: Configuración en Vercel detectando preset Ionic Angular y rama 'desarrollo'</w:t>
+            </w:r>
+          </w:p>
+          <w:p>
+            <w:pPr>
+              <w:spacing w:before="160" w:after="40"/>
+            </w:pPr>
+            <w:r>
+              <w:rPr>
+                <w:rFonts w:ascii="Calibri" w:hAnsi="Calibri"/>
+                <w:b/>
+                <w:color w:val="22543D"/>
+                <w:sz w:val="21"/>
+              </w:rPr>
+              <w:t>🌐 URL PÚBLICA EN PRODUCCIÓN VERIFICADA CON ÉXITO:</w:t>
+              <w:br/>
+            </w:r>
+          </w:p>
+          <w:p>
+            <w:pPr>
+              <w:spacing w:before="20" w:after="20"/>
+            </w:pPr>
+            <w:r>
+              <w:rPr>
+                <w:rFonts w:ascii="Calibri" w:hAnsi="Calibri"/>
+                <w:b/>
+                <w:color w:val="2D3748"/>
+                <w:sz w:val="19"/>
+              </w:rPr>
+              <w:t xml:space="preserve">✔ Portada / Inicio: </w:t>
             </w:r>
             <w:r>
               <w:rPr>
                 <w:rFonts w:ascii="Consolas" w:hAnsi="Consolas"/>
+                <w:color w:val="2B6CB0"/>
+                <w:sz w:val="18"/>
+              </w:rPr>
+              <w:t>https://dam2-productos-theta.vercel.app/inicio</w:t>
+            </w:r>
+          </w:p>
+          <w:p>
+            <w:pPr>
+              <w:spacing w:before="20" w:after="20"/>
+            </w:pPr>
+            <w:r>
+              <w:rPr>
+                <w:rFonts w:ascii="Calibri" w:hAnsi="Calibri"/>
                 <w:b/>
-                <w:color w:val="38A169"/>
+                <w:color w:val="2D3748"/>
                 <w:sz w:val="19"/>
               </w:rPr>
-              <w:t>[ ESPACIO RESERVADO PARA CAPTURA DE PANTALLA - EVIDENCIA 10 ]</w:t>
+              <w:t xml:space="preserve">✔ Catálogo / Productos: </w:t>
+            </w:r>
+            <w:r>
+              <w:rPr>
+                <w:rFonts w:ascii="Consolas" w:hAnsi="Consolas"/>
+                <w:color w:val="2B6CB0"/>
+                <w:sz w:val="18"/>
+              </w:rPr>
+              <w:t>https://dam2-productos-theta.vercel.app/productos</w:t>
+            </w:r>
+          </w:p>
+          <w:p>
+            <w:pPr>
+              <w:spacing w:before="20" w:after="20"/>
+            </w:pPr>
+            <w:r>
+              <w:rPr>
+                <w:rFonts w:ascii="Calibri" w:hAnsi="Calibri"/>
+                <w:b/>
+                <w:color w:val="2D3748"/>
+                <w:sz w:val="19"/>
+              </w:rPr>
+              <w:t xml:space="preserve">✔ Empresa / About: </w:t>
+            </w:r>
+            <w:r>
+              <w:rPr>
+                <w:rFonts w:ascii="Consolas" w:hAnsi="Consolas"/>
+                <w:color w:val="2B6CB0"/>
+                <w:sz w:val="18"/>
+              </w:rPr>
+              <w:t>https://dam2-productos-theta.vercel.app/about</w:t>
+            </w:r>
+          </w:p>
+          <w:p>
+            <w:pPr>
+              <w:spacing w:before="20" w:after="20"/>
+            </w:pPr>
+            <w:r>
+              <w:rPr>
+                <w:rFonts w:ascii="Calibri" w:hAnsi="Calibri"/>
+                <w:b/>
+                <w:color w:val="2D3748"/>
+                <w:sz w:val="19"/>
+              </w:rPr>
+              <w:t xml:space="preserve">✔ Repositorio GitHub: </w:t>
+            </w:r>
+            <w:r>
+              <w:rPr>
+                <w:rFonts w:ascii="Consolas" w:hAnsi="Consolas"/>
+                <w:color w:val="2B6CB0"/>
+                <w:sz w:val="18"/>
+              </w:rPr>
+              <w:t>https://github.com/alex060/dam2-productos.git (Rama desarrollo)</w:t>
             </w:r>
           </w:p>
         </w:tc>

</xml_diff>

<commit_message>
Actualizar autor a Alejandro en la memoria
</commit_message>
<xml_diff>
--- a/Memoria_Tecnica_DAM2_Productos.docx
+++ b/Memoria_Tecnica_DAM2_Productos.docx
@@ -96,13 +96,7 @@
               <w:spacing w:before="0" w:after="0"/>
             </w:pPr>
             <w:r>
-              <w:rPr>
-                <w:rFonts w:ascii="Calibri" w:hAnsi="Calibri"/>
-                <w:b w:val="0"/>
-                <w:color w:val="2D3748"/>
-                <w:sz w:val="19"/>
-              </w:rPr>
-              <w:t>José Ignacio (DAM2)</w:t>
+              <w:t>Alejandro (DAM2)</w:t>
             </w:r>
           </w:p>
         </w:tc>

</xml_diff>